<commit_message>
Add documentation and server implementations for email tools
- Created test documentation for proximity monitor, telemetry processor, and vessel position feed modules.
- Implemented Gmail email MCP server with functionality to send real emails via Gmail SMTP.
- Implemented MailHog email MCP server for development use, allowing email sending to a local MailHog instance.
- Added PowerShell script for backing up the DroneArjuna PostgreSQL database, including automated backup management.
</commit_message>
<xml_diff>
--- a/backend/app/tests/reports/modules/test_auth_documentation.docx
+++ b/backend/app/tests/reports/modules/test_auth_documentation.docx
@@ -12,12 +12,12 @@
     </w:p>
     <w:p>
       <w:r>
-        <w:t>Generated at: 2026-07-10T07:15:52+00:00</w:t>
+        <w:t>Generated at: 2026-07-31T11:45:01+00:00</w:t>
       </w:r>
     </w:p>
     <w:p>
       <w:r>
-        <w:t>Test session started: 2026-07-10T07:12:12+00:00</w:t>
+        <w:t>Test session started: 2026-07-31T11:44:55+00:00</w:t>
       </w:r>
     </w:p>
     <w:p>
@@ -88,95 +88,95 @@
           </w:tcPr>
           <w:p>
             <w:r>
+              <w:t>17</w:t>
+            </w:r>
+          </w:p>
+        </w:tc>
+      </w:tr>
+      <w:tr>
+        <w:tc>
+          <w:tcPr>
+            <w:tcW w:w="2400" w:type="dxa"/>
+          </w:tcPr>
+          <w:p>
+            <w:r>
+              <w:t>Passed</w:t>
+            </w:r>
+          </w:p>
+        </w:tc>
+        <w:tc>
+          <w:tcPr>
+            <w:tcW w:w="2400" w:type="dxa"/>
+          </w:tcPr>
+          <w:p>
+            <w:r>
+              <w:t>1</w:t>
+            </w:r>
+          </w:p>
+        </w:tc>
+      </w:tr>
+      <w:tr>
+        <w:tc>
+          <w:tcPr>
+            <w:tcW w:w="2400" w:type="dxa"/>
+          </w:tcPr>
+          <w:p>
+            <w:r>
+              <w:t>Failed</w:t>
+            </w:r>
+          </w:p>
+        </w:tc>
+        <w:tc>
+          <w:tcPr>
+            <w:tcW w:w="2400" w:type="dxa"/>
+          </w:tcPr>
+          <w:p>
+            <w:r>
+              <w:t>1</w:t>
+            </w:r>
+          </w:p>
+        </w:tc>
+      </w:tr>
+      <w:tr>
+        <w:tc>
+          <w:tcPr>
+            <w:tcW w:w="2400" w:type="dxa"/>
+          </w:tcPr>
+          <w:p>
+            <w:r>
+              <w:t>Skipped</w:t>
+            </w:r>
+          </w:p>
+        </w:tc>
+        <w:tc>
+          <w:tcPr>
+            <w:tcW w:w="2400" w:type="dxa"/>
+          </w:tcPr>
+          <w:p>
+            <w:r>
+              <w:t>0</w:t>
+            </w:r>
+          </w:p>
+        </w:tc>
+      </w:tr>
+      <w:tr>
+        <w:tc>
+          <w:tcPr>
+            <w:tcW w:w="2400" w:type="dxa"/>
+          </w:tcPr>
+          <w:p>
+            <w:r>
+              <w:t>Not run</w:t>
+            </w:r>
+          </w:p>
+        </w:tc>
+        <w:tc>
+          <w:tcPr>
+            <w:tcW w:w="2400" w:type="dxa"/>
+          </w:tcPr>
+          <w:p>
+            <w:r>
               <w:t>15</w:t>
-            </w:r>
-          </w:p>
-        </w:tc>
-      </w:tr>
-      <w:tr>
-        <w:tc>
-          <w:tcPr>
-            <w:tcW w:w="2400" w:type="dxa"/>
-          </w:tcPr>
-          <w:p>
-            <w:r>
-              <w:t>Passed</w:t>
-            </w:r>
-          </w:p>
-        </w:tc>
-        <w:tc>
-          <w:tcPr>
-            <w:tcW w:w="2400" w:type="dxa"/>
-          </w:tcPr>
-          <w:p>
-            <w:r>
-              <w:t>15</w:t>
-            </w:r>
-          </w:p>
-        </w:tc>
-      </w:tr>
-      <w:tr>
-        <w:tc>
-          <w:tcPr>
-            <w:tcW w:w="2400" w:type="dxa"/>
-          </w:tcPr>
-          <w:p>
-            <w:r>
-              <w:t>Failed</w:t>
-            </w:r>
-          </w:p>
-        </w:tc>
-        <w:tc>
-          <w:tcPr>
-            <w:tcW w:w="2400" w:type="dxa"/>
-          </w:tcPr>
-          <w:p>
-            <w:r>
-              <w:t>0</w:t>
-            </w:r>
-          </w:p>
-        </w:tc>
-      </w:tr>
-      <w:tr>
-        <w:tc>
-          <w:tcPr>
-            <w:tcW w:w="2400" w:type="dxa"/>
-          </w:tcPr>
-          <w:p>
-            <w:r>
-              <w:t>Skipped</w:t>
-            </w:r>
-          </w:p>
-        </w:tc>
-        <w:tc>
-          <w:tcPr>
-            <w:tcW w:w="2400" w:type="dxa"/>
-          </w:tcPr>
-          <w:p>
-            <w:r>
-              <w:t>0</w:t>
-            </w:r>
-          </w:p>
-        </w:tc>
-      </w:tr>
-      <w:tr>
-        <w:tc>
-          <w:tcPr>
-            <w:tcW w:w="2400" w:type="dxa"/>
-          </w:tcPr>
-          <w:p>
-            <w:r>
-              <w:t>Not run</w:t>
-            </w:r>
-          </w:p>
-        </w:tc>
-        <w:tc>
-          <w:tcPr>
-            <w:tcW w:w="2400" w:type="dxa"/>
-          </w:tcPr>
-          <w:p>
-            <w:r>
-              <w:t>0</w:t>
             </w:r>
           </w:p>
         </w:tc>
@@ -200,7 +200,7 @@
     </w:p>
     <w:p>
       <w:r>
-        <w:t>Source file: /app/app/tests/test_auth.py</w:t>
+        <w:t>Source file: C:\Users\Chandrasekhar\Downloads\DroneArjuna_final\DroneArjuna\backend\app\tests\test_auth.py</w:t>
       </w:r>
     </w:p>
     <w:tbl>
@@ -318,6 +318,150 @@
           </w:tcPr>
           <w:p>
             <w:r>
+              <w:t>test_admin_can_send_user_password_reset_email</w:t>
+            </w:r>
+          </w:p>
+        </w:tc>
+        <w:tc>
+          <w:tcPr>
+            <w:tcW w:w="2400" w:type="dxa"/>
+          </w:tcPr>
+          <w:p>
+            <w:r>
+              <w:t>Admin can send user password reset email</w:t>
+            </w:r>
+          </w:p>
+        </w:tc>
+        <w:tc>
+          <w:tcPr>
+            <w:tcW w:w="2400" w:type="dxa"/>
+          </w:tcPr>
+          <w:p>
+            <w:r>
+              <w:t>Failed</w:t>
+            </w:r>
+          </w:p>
+        </w:tc>
+        <w:tc>
+          <w:tcPr>
+            <w:tcW w:w="2400" w:type="dxa"/>
+          </w:tcPr>
+          <w:p>
+            <w:r>
+              <w:t>3.521</w:t>
+            </w:r>
+          </w:p>
+        </w:tc>
+        <w:tc>
+          <w:tcPr>
+            <w:tcW w:w="2400" w:type="dxa"/>
+          </w:tcPr>
+          <w:p>
+            <w:r>
+              <w:t>asyncio</w:t>
+            </w:r>
+          </w:p>
+        </w:tc>
+        <w:tc>
+          <w:tcPr>
+            <w:tcW w:w="2400" w:type="dxa"/>
+          </w:tcPr>
+          <w:p>
+            <w:r>
+              <w:t>client = &lt;httpx.AsyncClient object at 0x00000167AA5D4BB0&gt; | admin_user = &lt;app.models.user.User object at 0x00000167AA5D4F10&gt; | make_token = &lt;function make_token.&lt;locals&gt;._inner at 0x0000016791161090&gt; |     async def test_admin_can_send_user_password_reset_email( |         client: AsyncClient, admin_user, make_token |     ): |         from app.models.user import User |         from app.tests.conftest import _TestSession |         async with _TestSession() as session: |             new_user = User( |                 username="reset_user", |                 email="reset_user@example.com",</w:t>
+            </w:r>
+          </w:p>
+        </w:tc>
+      </w:tr>
+      <w:tr>
+        <w:tc>
+          <w:tcPr>
+            <w:tcW w:w="2400" w:type="dxa"/>
+          </w:tcPr>
+          <w:p>
+            <w:r>
+              <w:t>2</w:t>
+            </w:r>
+          </w:p>
+        </w:tc>
+        <w:tc>
+          <w:tcPr>
+            <w:tcW w:w="2400" w:type="dxa"/>
+          </w:tcPr>
+          <w:p>
+            <w:r>
+              <w:t>test_admin_reset_password_fails_when_smtp_disabled</w:t>
+            </w:r>
+          </w:p>
+        </w:tc>
+        <w:tc>
+          <w:tcPr>
+            <w:tcW w:w="2400" w:type="dxa"/>
+          </w:tcPr>
+          <w:p>
+            <w:r>
+              <w:t>Admin reset password fails when smtp disabled</w:t>
+            </w:r>
+          </w:p>
+        </w:tc>
+        <w:tc>
+          <w:tcPr>
+            <w:tcW w:w="2400" w:type="dxa"/>
+          </w:tcPr>
+          <w:p>
+            <w:r>
+              <w:t>Passed</w:t>
+            </w:r>
+          </w:p>
+        </w:tc>
+        <w:tc>
+          <w:tcPr>
+            <w:tcW w:w="2400" w:type="dxa"/>
+          </w:tcPr>
+          <w:p>
+            <w:r>
+              <w:t>0.515</w:t>
+            </w:r>
+          </w:p>
+        </w:tc>
+        <w:tc>
+          <w:tcPr>
+            <w:tcW w:w="2400" w:type="dxa"/>
+          </w:tcPr>
+          <w:p>
+            <w:r>
+              <w:t>asyncio</w:t>
+            </w:r>
+          </w:p>
+        </w:tc>
+        <w:tc>
+          <w:tcPr>
+            <w:tcW w:w="2400" w:type="dxa"/>
+          </w:tcPr>
+          <w:p>
+            <w:r>
+              <w:t>-</w:t>
+            </w:r>
+          </w:p>
+        </w:tc>
+      </w:tr>
+      <w:tr>
+        <w:tc>
+          <w:tcPr>
+            <w:tcW w:w="2400" w:type="dxa"/>
+          </w:tcPr>
+          <w:p>
+            <w:r>
+              <w:t>3</w:t>
+            </w:r>
+          </w:p>
+        </w:tc>
+        <w:tc>
+          <w:tcPr>
+            <w:tcW w:w="2400" w:type="dxa"/>
+          </w:tcPr>
+          <w:p>
+            <w:r>
               <w:t>test_expired_token_is_401</w:t>
             </w:r>
           </w:p>
@@ -338,17 +482,17 @@
           </w:tcPr>
           <w:p>
             <w:r>
-              <w:t>Passed</w:t>
-            </w:r>
-          </w:p>
-        </w:tc>
-        <w:tc>
-          <w:tcPr>
-            <w:tcW w:w="2400" w:type="dxa"/>
-          </w:tcPr>
-          <w:p>
-            <w:r>
-              <w:t>0.408</w:t>
+              <w:t>Not run</w:t>
+            </w:r>
+          </w:p>
+        </w:tc>
+        <w:tc>
+          <w:tcPr>
+            <w:tcW w:w="2400" w:type="dxa"/>
+          </w:tcPr>
+          <w:p>
+            <w:r>
+              <w:t>0.000</w:t>
             </w:r>
           </w:p>
         </w:tc>
@@ -380,7 +524,7 @@
           </w:tcPr>
           <w:p>
             <w:r>
-              <w:t>2</w:t>
+              <w:t>4</w:t>
             </w:r>
           </w:p>
         </w:tc>
@@ -410,17 +554,17 @@
           </w:tcPr>
           <w:p>
             <w:r>
-              <w:t>Passed</w:t>
-            </w:r>
-          </w:p>
-        </w:tc>
-        <w:tc>
-          <w:tcPr>
-            <w:tcW w:w="2400" w:type="dxa"/>
-          </w:tcPr>
-          <w:p>
-            <w:r>
-              <w:t>0.775</w:t>
+              <w:t>Not run</w:t>
+            </w:r>
+          </w:p>
+        </w:tc>
+        <w:tc>
+          <w:tcPr>
+            <w:tcW w:w="2400" w:type="dxa"/>
+          </w:tcPr>
+          <w:p>
+            <w:r>
+              <w:t>0.000</w:t>
             </w:r>
           </w:p>
         </w:tc>
@@ -452,7 +596,7 @@
           </w:tcPr>
           <w:p>
             <w:r>
-              <w:t>3</w:t>
+              <w:t>5</w:t>
             </w:r>
           </w:p>
         </w:tc>
@@ -482,17 +626,17 @@
           </w:tcPr>
           <w:p>
             <w:r>
-              <w:t>Passed</w:t>
-            </w:r>
-          </w:p>
-        </w:tc>
-        <w:tc>
-          <w:tcPr>
-            <w:tcW w:w="2400" w:type="dxa"/>
-          </w:tcPr>
-          <w:p>
-            <w:r>
-              <w:t>0.774</w:t>
+              <w:t>Not run</w:t>
+            </w:r>
+          </w:p>
+        </w:tc>
+        <w:tc>
+          <w:tcPr>
+            <w:tcW w:w="2400" w:type="dxa"/>
+          </w:tcPr>
+          <w:p>
+            <w:r>
+              <w:t>0.000</w:t>
             </w:r>
           </w:p>
         </w:tc>
@@ -524,7 +668,7 @@
           </w:tcPr>
           <w:p>
             <w:r>
-              <w:t>4</w:t>
+              <w:t>6</w:t>
             </w:r>
           </w:p>
         </w:tc>
@@ -554,17 +698,17 @@
           </w:tcPr>
           <w:p>
             <w:r>
-              <w:t>Passed</w:t>
-            </w:r>
-          </w:p>
-        </w:tc>
-        <w:tc>
-          <w:tcPr>
-            <w:tcW w:w="2400" w:type="dxa"/>
-          </w:tcPr>
-          <w:p>
-            <w:r>
-              <w:t>0.759</w:t>
+              <w:t>Not run</w:t>
+            </w:r>
+          </w:p>
+        </w:tc>
+        <w:tc>
+          <w:tcPr>
+            <w:tcW w:w="2400" w:type="dxa"/>
+          </w:tcPr>
+          <w:p>
+            <w:r>
+              <w:t>0.000</w:t>
             </w:r>
           </w:p>
         </w:tc>
@@ -596,7 +740,7 @@
           </w:tcPr>
           <w:p>
             <w:r>
-              <w:t>5</w:t>
+              <w:t>7</w:t>
             </w:r>
           </w:p>
         </w:tc>
@@ -626,17 +770,17 @@
           </w:tcPr>
           <w:p>
             <w:r>
-              <w:t>Passed</w:t>
-            </w:r>
-          </w:p>
-        </w:tc>
-        <w:tc>
-          <w:tcPr>
-            <w:tcW w:w="2400" w:type="dxa"/>
-          </w:tcPr>
-          <w:p>
-            <w:r>
-              <w:t>0.029</w:t>
+              <w:t>Not run</w:t>
+            </w:r>
+          </w:p>
+        </w:tc>
+        <w:tc>
+          <w:tcPr>
+            <w:tcW w:w="2400" w:type="dxa"/>
+          </w:tcPr>
+          <w:p>
+            <w:r>
+              <w:t>0.000</w:t>
             </w:r>
           </w:p>
         </w:tc>
@@ -668,7 +812,7 @@
           </w:tcPr>
           <w:p>
             <w:r>
-              <w:t>6</w:t>
+              <w:t>8</w:t>
             </w:r>
           </w:p>
         </w:tc>
@@ -698,17 +842,17 @@
           </w:tcPr>
           <w:p>
             <w:r>
-              <w:t>Passed</w:t>
-            </w:r>
-          </w:p>
-        </w:tc>
-        <w:tc>
-          <w:tcPr>
-            <w:tcW w:w="2400" w:type="dxa"/>
-          </w:tcPr>
-          <w:p>
-            <w:r>
-              <w:t>0.794</w:t>
+              <w:t>Not run</w:t>
+            </w:r>
+          </w:p>
+        </w:tc>
+        <w:tc>
+          <w:tcPr>
+            <w:tcW w:w="2400" w:type="dxa"/>
+          </w:tcPr>
+          <w:p>
+            <w:r>
+              <w:t>0.000</w:t>
             </w:r>
           </w:p>
         </w:tc>
@@ -740,7 +884,7 @@
           </w:tcPr>
           <w:p>
             <w:r>
-              <w:t>7</w:t>
+              <w:t>9</w:t>
             </w:r>
           </w:p>
         </w:tc>
@@ -770,17 +914,17 @@
           </w:tcPr>
           <w:p>
             <w:r>
-              <w:t>Passed</w:t>
-            </w:r>
-          </w:p>
-        </w:tc>
-        <w:tc>
-          <w:tcPr>
-            <w:tcW w:w="2400" w:type="dxa"/>
-          </w:tcPr>
-          <w:p>
-            <w:r>
-              <w:t>0.023</w:t>
+              <w:t>Not run</w:t>
+            </w:r>
+          </w:p>
+        </w:tc>
+        <w:tc>
+          <w:tcPr>
+            <w:tcW w:w="2400" w:type="dxa"/>
+          </w:tcPr>
+          <w:p>
+            <w:r>
+              <w:t>0.000</w:t>
             </w:r>
           </w:p>
         </w:tc>
@@ -812,7 +956,7 @@
           </w:tcPr>
           <w:p>
             <w:r>
-              <w:t>8</w:t>
+              <w:t>10</w:t>
             </w:r>
           </w:p>
         </w:tc>
@@ -842,17 +986,17 @@
           </w:tcPr>
           <w:p>
             <w:r>
-              <w:t>Passed</w:t>
-            </w:r>
-          </w:p>
-        </w:tc>
-        <w:tc>
-          <w:tcPr>
-            <w:tcW w:w="2400" w:type="dxa"/>
-          </w:tcPr>
-          <w:p>
-            <w:r>
-              <w:t>0.024</w:t>
+              <w:t>Not run</w:t>
+            </w:r>
+          </w:p>
+        </w:tc>
+        <w:tc>
+          <w:tcPr>
+            <w:tcW w:w="2400" w:type="dxa"/>
+          </w:tcPr>
+          <w:p>
+            <w:r>
+              <w:t>0.000</w:t>
             </w:r>
           </w:p>
         </w:tc>
@@ -884,7 +1028,7 @@
           </w:tcPr>
           <w:p>
             <w:r>
-              <w:t>9</w:t>
+              <w:t>11</w:t>
             </w:r>
           </w:p>
         </w:tc>
@@ -914,17 +1058,17 @@
           </w:tcPr>
           <w:p>
             <w:r>
-              <w:t>Passed</w:t>
-            </w:r>
-          </w:p>
-        </w:tc>
-        <w:tc>
-          <w:tcPr>
-            <w:tcW w:w="2400" w:type="dxa"/>
-          </w:tcPr>
-          <w:p>
-            <w:r>
-              <w:t>0.383</w:t>
+              <w:t>Not run</w:t>
+            </w:r>
+          </w:p>
+        </w:tc>
+        <w:tc>
+          <w:tcPr>
+            <w:tcW w:w="2400" w:type="dxa"/>
+          </w:tcPr>
+          <w:p>
+            <w:r>
+              <w:t>0.000</w:t>
             </w:r>
           </w:p>
         </w:tc>
@@ -956,7 +1100,7 @@
           </w:tcPr>
           <w:p>
             <w:r>
-              <w:t>10</w:t>
+              <w:t>12</w:t>
             </w:r>
           </w:p>
         </w:tc>
@@ -986,17 +1130,17 @@
           </w:tcPr>
           <w:p>
             <w:r>
-              <w:t>Passed</w:t>
-            </w:r>
-          </w:p>
-        </w:tc>
-        <w:tc>
-          <w:tcPr>
-            <w:tcW w:w="2400" w:type="dxa"/>
-          </w:tcPr>
-          <w:p>
-            <w:r>
-              <w:t>0.382</w:t>
+              <w:t>Not run</w:t>
+            </w:r>
+          </w:p>
+        </w:tc>
+        <w:tc>
+          <w:tcPr>
+            <w:tcW w:w="2400" w:type="dxa"/>
+          </w:tcPr>
+          <w:p>
+            <w:r>
+              <w:t>0.000</w:t>
             </w:r>
           </w:p>
         </w:tc>
@@ -1028,7 +1172,7 @@
           </w:tcPr>
           <w:p>
             <w:r>
-              <w:t>11</w:t>
+              <w:t>13</w:t>
             </w:r>
           </w:p>
         </w:tc>
@@ -1058,17 +1202,17 @@
           </w:tcPr>
           <w:p>
             <w:r>
-              <w:t>Passed</w:t>
-            </w:r>
-          </w:p>
-        </w:tc>
-        <w:tc>
-          <w:tcPr>
-            <w:tcW w:w="2400" w:type="dxa"/>
-          </w:tcPr>
-          <w:p>
-            <w:r>
-              <w:t>0.395</w:t>
+              <w:t>Not run</w:t>
+            </w:r>
+          </w:p>
+        </w:tc>
+        <w:tc>
+          <w:tcPr>
+            <w:tcW w:w="2400" w:type="dxa"/>
+          </w:tcPr>
+          <w:p>
+            <w:r>
+              <w:t>0.000</w:t>
             </w:r>
           </w:p>
         </w:tc>
@@ -1100,7 +1244,7 @@
           </w:tcPr>
           <w:p>
             <w:r>
-              <w:t>12</w:t>
+              <w:t>14</w:t>
             </w:r>
           </w:p>
         </w:tc>
@@ -1130,17 +1274,17 @@
           </w:tcPr>
           <w:p>
             <w:r>
-              <w:t>Passed</w:t>
-            </w:r>
-          </w:p>
-        </w:tc>
-        <w:tc>
-          <w:tcPr>
-            <w:tcW w:w="2400" w:type="dxa"/>
-          </w:tcPr>
-          <w:p>
-            <w:r>
-              <w:t>0.388</w:t>
+              <w:t>Not run</w:t>
+            </w:r>
+          </w:p>
+        </w:tc>
+        <w:tc>
+          <w:tcPr>
+            <w:tcW w:w="2400" w:type="dxa"/>
+          </w:tcPr>
+          <w:p>
+            <w:r>
+              <w:t>0.000</w:t>
             </w:r>
           </w:p>
         </w:tc>
@@ -1172,7 +1316,7 @@
           </w:tcPr>
           <w:p>
             <w:r>
-              <w:t>13</w:t>
+              <w:t>15</w:t>
             </w:r>
           </w:p>
         </w:tc>
@@ -1202,17 +1346,17 @@
           </w:tcPr>
           <w:p>
             <w:r>
-              <w:t>Passed</w:t>
-            </w:r>
-          </w:p>
-        </w:tc>
-        <w:tc>
-          <w:tcPr>
-            <w:tcW w:w="2400" w:type="dxa"/>
-          </w:tcPr>
-          <w:p>
-            <w:r>
-              <w:t>0.386</w:t>
+              <w:t>Not run</w:t>
+            </w:r>
+          </w:p>
+        </w:tc>
+        <w:tc>
+          <w:tcPr>
+            <w:tcW w:w="2400" w:type="dxa"/>
+          </w:tcPr>
+          <w:p>
+            <w:r>
+              <w:t>0.000</w:t>
             </w:r>
           </w:p>
         </w:tc>
@@ -1244,7 +1388,7 @@
           </w:tcPr>
           <w:p>
             <w:r>
-              <w:t>14</w:t>
+              <w:t>16</w:t>
             </w:r>
           </w:p>
         </w:tc>
@@ -1274,17 +1418,17 @@
           </w:tcPr>
           <w:p>
             <w:r>
-              <w:t>Passed</w:t>
-            </w:r>
-          </w:p>
-        </w:tc>
-        <w:tc>
-          <w:tcPr>
-            <w:tcW w:w="2400" w:type="dxa"/>
-          </w:tcPr>
-          <w:p>
-            <w:r>
-              <w:t>1.523</w:t>
+              <w:t>Not run</w:t>
+            </w:r>
+          </w:p>
+        </w:tc>
+        <w:tc>
+          <w:tcPr>
+            <w:tcW w:w="2400" w:type="dxa"/>
+          </w:tcPr>
+          <w:p>
+            <w:r>
+              <w:t>0.000</w:t>
             </w:r>
           </w:p>
         </w:tc>
@@ -1316,7 +1460,7 @@
           </w:tcPr>
           <w:p>
             <w:r>
-              <w:t>15</w:t>
+              <w:t>17</w:t>
             </w:r>
           </w:p>
         </w:tc>
@@ -1346,17 +1490,17 @@
           </w:tcPr>
           <w:p>
             <w:r>
-              <w:t>Passed</w:t>
-            </w:r>
-          </w:p>
-        </w:tc>
-        <w:tc>
-          <w:tcPr>
-            <w:tcW w:w="2400" w:type="dxa"/>
-          </w:tcPr>
-          <w:p>
-            <w:r>
-              <w:t>0.749</w:t>
+              <w:t>Not run</w:t>
+            </w:r>
+          </w:p>
+        </w:tc>
+        <w:tc>
+          <w:tcPr>
+            <w:tcW w:w="2400" w:type="dxa"/>
+          </w:tcPr>
+          <w:p>
+            <w:r>
+              <w:t>0.000</w:t>
             </w:r>
           </w:p>
         </w:tc>

</xml_diff>